<commit_message>
feat: lab 2 network mode and launch scripts, lab 3 scripts, docs and updated reports
</commit_message>
<xml_diff>
--- a/airp/lab1/report/Отчет_ЛР1.docx
+++ b/airp/lab1/report/Отчет_ЛР1.docx
@@ -297,7 +297,7 @@
       <w:r>
         <w:fldChar w:fldCharType="separate"/>
       </w:r>
-      <w:hyperlink w:anchor="_Toc242378912" w:history="1">
+      <w:hyperlink w:anchor="_Toc242385922" w:history="1">
         <w:r>
           <w:rPr>
             <w:rStyle w:val="aff8"/>
@@ -324,7 +324,7 @@
             <w:noProof/>
             <w:webHidden/>
           </w:rPr>
-          <w:instrText xml:space="preserve"> PAGEREF _Toc242378912 \h </w:instrText>
+          <w:instrText xml:space="preserve"> PAGEREF _Toc242385922 \h </w:instrText>
         </w:r>
         <w:r>
           <w:rPr>
@@ -370,7 +370,7 @@
           <w14:ligatures w14:val="standardContextual"/>
         </w:rPr>
       </w:pPr>
-      <w:hyperlink w:anchor="_Toc242378913" w:history="1">
+      <w:hyperlink w:anchor="_Toc242385923" w:history="1">
         <w:r>
           <w:rPr>
             <w:rStyle w:val="aff8"/>
@@ -397,7 +397,7 @@
             <w:noProof/>
             <w:webHidden/>
           </w:rPr>
-          <w:instrText xml:space="preserve"> PAGEREF _Toc242378913 \h </w:instrText>
+          <w:instrText xml:space="preserve"> PAGEREF _Toc242385923 \h </w:instrText>
         </w:r>
         <w:r>
           <w:rPr>
@@ -443,7 +443,7 @@
           <w14:ligatures w14:val="standardContextual"/>
         </w:rPr>
       </w:pPr>
-      <w:hyperlink w:anchor="_Toc242378914" w:history="1">
+      <w:hyperlink w:anchor="_Toc242385924" w:history="1">
         <w:r>
           <w:rPr>
             <w:rStyle w:val="aff8"/>
@@ -470,7 +470,7 @@
             <w:noProof/>
             <w:webHidden/>
           </w:rPr>
-          <w:instrText xml:space="preserve"> PAGEREF _Toc242378914 \h </w:instrText>
+          <w:instrText xml:space="preserve"> PAGEREF _Toc242385924 \h </w:instrText>
         </w:r>
         <w:r>
           <w:rPr>
@@ -516,7 +516,7 @@
           <w14:ligatures w14:val="standardContextual"/>
         </w:rPr>
       </w:pPr>
-      <w:hyperlink w:anchor="_Toc242378915" w:history="1">
+      <w:hyperlink w:anchor="_Toc242385925" w:history="1">
         <w:r>
           <w:rPr>
             <w:rStyle w:val="aff8"/>
@@ -543,7 +543,7 @@
             <w:noProof/>
             <w:webHidden/>
           </w:rPr>
-          <w:instrText xml:space="preserve"> PAGEREF _Toc242378915 \h </w:instrText>
+          <w:instrText xml:space="preserve"> PAGEREF _Toc242385925 \h </w:instrText>
         </w:r>
         <w:r>
           <w:rPr>
@@ -589,7 +589,7 @@
           <w14:ligatures w14:val="standardContextual"/>
         </w:rPr>
       </w:pPr>
-      <w:hyperlink w:anchor="_Toc242378916" w:history="1">
+      <w:hyperlink w:anchor="_Toc242385926" w:history="1">
         <w:r>
           <w:rPr>
             <w:rStyle w:val="aff8"/>
@@ -616,7 +616,7 @@
             <w:noProof/>
             <w:webHidden/>
           </w:rPr>
-          <w:instrText xml:space="preserve"> PAGEREF _Toc242378916 \h </w:instrText>
+          <w:instrText xml:space="preserve"> PAGEREF _Toc242385926 \h </w:instrText>
         </w:r>
         <w:r>
           <w:rPr>
@@ -662,7 +662,7 @@
           <w14:ligatures w14:val="standardContextual"/>
         </w:rPr>
       </w:pPr>
-      <w:hyperlink w:anchor="_Toc242378917" w:history="1">
+      <w:hyperlink w:anchor="_Toc242385927" w:history="1">
         <w:r>
           <w:rPr>
             <w:rStyle w:val="aff8"/>
@@ -689,7 +689,7 @@
             <w:noProof/>
             <w:webHidden/>
           </w:rPr>
-          <w:instrText xml:space="preserve"> PAGEREF _Toc242378917 \h </w:instrText>
+          <w:instrText xml:space="preserve"> PAGEREF _Toc242385927 \h </w:instrText>
         </w:r>
         <w:r>
           <w:rPr>
@@ -735,7 +735,7 @@
           <w14:ligatures w14:val="standardContextual"/>
         </w:rPr>
       </w:pPr>
-      <w:hyperlink w:anchor="_Toc242378918" w:history="1">
+      <w:hyperlink w:anchor="_Toc242385928" w:history="1">
         <w:r>
           <w:rPr>
             <w:rStyle w:val="aff8"/>
@@ -762,7 +762,7 @@
             <w:noProof/>
             <w:webHidden/>
           </w:rPr>
-          <w:instrText xml:space="preserve"> PAGEREF _Toc242378918 \h </w:instrText>
+          <w:instrText xml:space="preserve"> PAGEREF _Toc242385928 \h </w:instrText>
         </w:r>
         <w:r>
           <w:rPr>
@@ -808,7 +808,7 @@
           <w14:ligatures w14:val="standardContextual"/>
         </w:rPr>
       </w:pPr>
-      <w:hyperlink w:anchor="_Toc242378919" w:history="1">
+      <w:hyperlink w:anchor="_Toc242385929" w:history="1">
         <w:r>
           <w:rPr>
             <w:rStyle w:val="aff8"/>
@@ -835,7 +835,7 @@
             <w:noProof/>
             <w:webHidden/>
           </w:rPr>
-          <w:instrText xml:space="preserve"> PAGEREF _Toc242378919 \h </w:instrText>
+          <w:instrText xml:space="preserve"> PAGEREF _Toc242385929 \h </w:instrText>
         </w:r>
         <w:r>
           <w:rPr>
@@ -881,7 +881,7 @@
           <w14:ligatures w14:val="standardContextual"/>
         </w:rPr>
       </w:pPr>
-      <w:hyperlink w:anchor="_Toc242378920" w:history="1">
+      <w:hyperlink w:anchor="_Toc242385930" w:history="1">
         <w:r>
           <w:rPr>
             <w:rStyle w:val="aff8"/>
@@ -916,7 +916,7 @@
             <w:noProof/>
             <w:webHidden/>
           </w:rPr>
-          <w:instrText xml:space="preserve"> PAGEREF _Toc242378920 \h </w:instrText>
+          <w:instrText xml:space="preserve"> PAGEREF _Toc242385930 \h </w:instrText>
         </w:r>
         <w:r>
           <w:rPr>
@@ -962,7 +962,7 @@
           <w14:ligatures w14:val="standardContextual"/>
         </w:rPr>
       </w:pPr>
-      <w:hyperlink w:anchor="_Toc242378921" w:history="1">
+      <w:hyperlink w:anchor="_Toc242385931" w:history="1">
         <w:r>
           <w:rPr>
             <w:rStyle w:val="aff8"/>
@@ -989,7 +989,7 @@
             <w:noProof/>
             <w:webHidden/>
           </w:rPr>
-          <w:instrText xml:space="preserve"> PAGEREF _Toc242378921 \h </w:instrText>
+          <w:instrText xml:space="preserve"> PAGEREF _Toc242385931 \h </w:instrText>
         </w:r>
         <w:r>
           <w:rPr>
@@ -1035,7 +1035,7 @@
           <w14:ligatures w14:val="standardContextual"/>
         </w:rPr>
       </w:pPr>
-      <w:hyperlink w:anchor="_Toc242378922" w:history="1">
+      <w:hyperlink w:anchor="_Toc242385932" w:history="1">
         <w:r>
           <w:rPr>
             <w:rStyle w:val="aff8"/>
@@ -1077,7 +1077,7 @@
             <w:noProof/>
             <w:webHidden/>
           </w:rPr>
-          <w:instrText xml:space="preserve"> PAGEREF _Toc242378922 \h </w:instrText>
+          <w:instrText xml:space="preserve"> PAGEREF _Toc242385932 \h </w:instrText>
         </w:r>
         <w:r>
           <w:rPr>
@@ -1123,7 +1123,7 @@
           <w14:ligatures w14:val="standardContextual"/>
         </w:rPr>
       </w:pPr>
-      <w:hyperlink w:anchor="_Toc242378923" w:history="1">
+      <w:hyperlink w:anchor="_Toc242385933" w:history="1">
         <w:r>
           <w:rPr>
             <w:rStyle w:val="aff8"/>
@@ -1150,7 +1150,7 @@
             <w:noProof/>
             <w:webHidden/>
           </w:rPr>
-          <w:instrText xml:space="preserve"> PAGEREF _Toc242378923 \h </w:instrText>
+          <w:instrText xml:space="preserve"> PAGEREF _Toc242385933 \h </w:instrText>
         </w:r>
         <w:r>
           <w:rPr>
@@ -1196,7 +1196,7 @@
           <w14:ligatures w14:val="standardContextual"/>
         </w:rPr>
       </w:pPr>
-      <w:hyperlink w:anchor="_Toc242378924" w:history="1">
+      <w:hyperlink w:anchor="_Toc242385934" w:history="1">
         <w:r>
           <w:rPr>
             <w:rStyle w:val="aff8"/>
@@ -1223,7 +1223,7 @@
             <w:noProof/>
             <w:webHidden/>
           </w:rPr>
-          <w:instrText xml:space="preserve"> PAGEREF _Toc242378924 \h </w:instrText>
+          <w:instrText xml:space="preserve"> PAGEREF _Toc242385934 \h </w:instrText>
         </w:r>
         <w:r>
           <w:rPr>
@@ -1269,7 +1269,7 @@
         <w:pStyle w:val="1"/>
         <w:ind w:firstLine="709"/>
       </w:pPr>
-      <w:bookmarkStart w:id="0" w:name="_Toc242378912"/>
+      <w:bookmarkStart w:id="0" w:name="_Toc242385922"/>
       <w:r>
         <w:rPr>
           <w:rFonts w:ascii="Times New Roman" w:hAnsi="Times New Roman"/>
@@ -1307,7 +1307,7 @@
         <w:pStyle w:val="1"/>
         <w:ind w:firstLine="709"/>
       </w:pPr>
-      <w:bookmarkStart w:id="1" w:name="_Toc242378913"/>
+      <w:bookmarkStart w:id="1" w:name="_Toc242385923"/>
       <w:r>
         <w:rPr>
           <w:rFonts w:ascii="Times New Roman" w:hAnsi="Times New Roman"/>
@@ -1525,7 +1525,7 @@
         <w:pStyle w:val="1"/>
         <w:ind w:firstLine="709"/>
       </w:pPr>
-      <w:bookmarkStart w:id="2" w:name="_Toc242378914"/>
+      <w:bookmarkStart w:id="2" w:name="_Toc242385924"/>
       <w:r>
         <w:rPr>
           <w:rFonts w:ascii="Times New Roman" w:hAnsi="Times New Roman"/>
@@ -1541,7 +1541,7 @@
         <w:spacing w:before="360"/>
         <w:ind w:firstLine="709"/>
       </w:pPr>
-      <w:bookmarkStart w:id="3" w:name="_Toc242378915"/>
+      <w:bookmarkStart w:id="3" w:name="_Toc242385925"/>
       <w:r>
         <w:rPr>
           <w:rFonts w:ascii="Times New Roman" w:hAnsi="Times New Roman"/>
@@ -1700,7 +1700,7 @@
         <w:spacing w:before="360"/>
         <w:ind w:firstLine="709"/>
       </w:pPr>
-      <w:bookmarkStart w:id="4" w:name="_Toc242378916"/>
+      <w:bookmarkStart w:id="4" w:name="_Toc242385926"/>
       <w:r>
         <w:rPr>
           <w:rFonts w:ascii="Times New Roman" w:hAnsi="Times New Roman"/>
@@ -2069,7 +2069,7 @@
         <w:spacing w:before="360"/>
         <w:ind w:firstLine="709"/>
       </w:pPr>
-      <w:bookmarkStart w:id="5" w:name="_Toc242378917"/>
+      <w:bookmarkStart w:id="5" w:name="_Toc242385927"/>
       <w:r>
         <w:rPr>
           <w:rFonts w:ascii="Times New Roman" w:hAnsi="Times New Roman"/>
@@ -2154,431 +2154,288 @@
     </w:p>
     <w:p>
       <w:pPr>
-        <w:spacing w:line="240" w:lineRule="auto"/>
-      </w:pPr>
-      <w:r>
-        <w:rPr>
-          <w:i/>
-          <w:sz w:val="24"/>
-        </w:rPr>
+        <w:pStyle w:val="Listing"/>
+      </w:pPr>
+      <w:r>
         <w:t>public void actionPerformed(ActionEvent ae) {</w:t>
       </w:r>
     </w:p>
     <w:p>
       <w:pPr>
-        <w:spacing w:line="240" w:lineRule="auto"/>
-      </w:pPr>
-      <w:r>
-        <w:rPr>
-          <w:i/>
-          <w:sz w:val="24"/>
-        </w:rPr>
+        <w:pStyle w:val="Listing"/>
+      </w:pPr>
+      <w:r>
         <w:t xml:space="preserve">    if (ae.getSource() == exitButton) {</w:t>
       </w:r>
     </w:p>
     <w:p>
       <w:pPr>
-        <w:spacing w:line="240" w:lineRule="auto"/>
-      </w:pPr>
-      <w:r>
-        <w:rPr>
-          <w:i/>
-          <w:sz w:val="24"/>
-        </w:rPr>
+        <w:pStyle w:val="Listing"/>
+      </w:pPr>
+      <w:r>
         <w:t xml:space="preserve">        System.exit(0);</w:t>
       </w:r>
     </w:p>
     <w:p>
       <w:pPr>
-        <w:spacing w:line="240" w:lineRule="auto"/>
-      </w:pPr>
-      <w:r>
-        <w:rPr>
-          <w:i/>
-          <w:sz w:val="24"/>
-        </w:rPr>
-        <w:t xml:space="preserve">    } else if (</w:t>
-      </w:r>
-      <w:r>
-        <w:rPr>
-          <w:i/>
-          <w:sz w:val="24"/>
-        </w:rPr>
-        <w:t>ae.getSource() == searchButton) {</w:t>
-      </w:r>
-    </w:p>
-    <w:p>
-      <w:pPr>
-        <w:spacing w:line="240" w:lineRule="auto"/>
-      </w:pPr>
-      <w:r>
-        <w:rPr>
-          <w:i/>
-          <w:sz w:val="24"/>
-        </w:rPr>
+        <w:pStyle w:val="Listing"/>
+      </w:pPr>
+      <w:r>
+        <w:t xml:space="preserve">    } else if (ae.getSource() == searchButton) {</w:t>
+      </w:r>
+    </w:p>
+    <w:p>
+      <w:pPr>
+        <w:pStyle w:val="Listing"/>
+      </w:pPr>
+      <w:r>
         <w:t xml:space="preserve">        // Ключевые слова (симптомы) разделяются запятыми</w:t>
       </w:r>
     </w:p>
     <w:p>
       <w:pPr>
-        <w:spacing w:line="240" w:lineRule="auto"/>
-      </w:pPr>
-      <w:r>
-        <w:rPr>
-          <w:i/>
-          <w:sz w:val="24"/>
-        </w:rPr>
+        <w:pStyle w:val="Listing"/>
+      </w:pPr>
+      <w:r>
         <w:t xml:space="preserve">        String[] keywords = textArea.getText().split(",");</w:t>
       </w:r>
     </w:p>
     <w:p>
       <w:pPr>
-        <w:spacing w:line="240" w:lineRule="auto"/>
-      </w:pPr>
-      <w:r>
-        <w:rPr>
-          <w:i/>
-          <w:sz w:val="24"/>
-        </w:rPr>
+        <w:pStyle w:val="Listing"/>
+      </w:pPr>
+      <w:r>
         <w:t xml:space="preserve">        textArea.setText("");</w:t>
       </w:r>
     </w:p>
     <w:p>
       <w:pPr>
-        <w:spacing w:line="240" w:lineRule="auto"/>
-      </w:pPr>
-    </w:p>
-    <w:p>
-      <w:pPr>
-        <w:spacing w:line="240" w:lineRule="auto"/>
-      </w:pPr>
-      <w:r>
-        <w:rPr>
-          <w:i/>
-          <w:sz w:val="24"/>
-        </w:rPr>
+        <w:pStyle w:val="Listing"/>
+      </w:pPr>
+    </w:p>
+    <w:p>
+      <w:pPr>
+        <w:pStyle w:val="Listing"/>
+      </w:pPr>
+      <w:r>
         <w:t xml:space="preserve">        // Список лекарств читается из текстового файла</w:t>
       </w:r>
     </w:p>
     <w:p>
       <w:pPr>
-        <w:spacing w:line="240" w:lineRule="auto"/>
-      </w:pPr>
-      <w:r>
-        <w:rPr>
-          <w:i/>
-          <w:sz w:val="24"/>
-        </w:rPr>
+        <w:pStyle w:val="Listing"/>
+      </w:pPr>
+      <w:r>
         <w:t xml:space="preserve">        File medicinesFile = new File("medicines.txt");</w:t>
       </w:r>
     </w:p>
     <w:p>
       <w:pPr>
-        <w:spacing w:line="240" w:lineRule="auto"/>
-      </w:pPr>
-      <w:r>
-        <w:rPr>
-          <w:i/>
-          <w:sz w:val="24"/>
-        </w:rPr>
+        <w:pStyle w:val="Listing"/>
+      </w:pPr>
+      <w:r>
         <w:t xml:space="preserve">        ArrayList&lt;String&gt; medicines = readLines(medicinesFile);</w:t>
       </w:r>
     </w:p>
     <w:p>
       <w:pPr>
-        <w:spacing w:line="240" w:lineRule="auto"/>
-      </w:pPr>
-    </w:p>
-    <w:p>
-      <w:pPr>
-        <w:spacing w:line="240" w:lineRule="auto"/>
-      </w:pPr>
-      <w:r>
-        <w:rPr>
-          <w:i/>
-          <w:sz w:val="24"/>
-        </w:rPr>
+        <w:pStyle w:val="Listing"/>
+      </w:pPr>
+    </w:p>
+    <w:p>
+      <w:pPr>
+        <w:pStyle w:val="Listing"/>
+      </w:pPr>
+      <w:r>
         <w:t xml:space="preserve">        String bestName = null;</w:t>
       </w:r>
     </w:p>
     <w:p>
       <w:pPr>
-        <w:spacing w:line="240" w:lineRule="auto"/>
-      </w:pPr>
-      <w:r>
-        <w:rPr>
-          <w:i/>
-          <w:sz w:val="24"/>
-        </w:rPr>
+        <w:pStyle w:val="Listing"/>
+      </w:pPr>
+      <w:r>
         <w:t xml:space="preserve">        int bestCount = 0;</w:t>
       </w:r>
     </w:p>
     <w:p>
       <w:pPr>
-        <w:spacing w:line="240" w:lineRule="auto"/>
-      </w:pPr>
-      <w:r>
-        <w:rPr>
-          <w:i/>
-          <w:sz w:val="24"/>
-        </w:rPr>
+        <w:pStyle w:val="Listing"/>
+      </w:pPr>
+      <w:r>
         <w:t xml:space="preserve">        for (String line : medicines) {</w:t>
       </w:r>
     </w:p>
     <w:p>
       <w:pPr>
-        <w:spacing w:line="240" w:lineRule="auto"/>
-      </w:pPr>
-      <w:r>
-        <w:rPr>
-          <w:i/>
-          <w:sz w:val="24"/>
-        </w:rPr>
+        <w:pStyle w:val="Listing"/>
+      </w:pPr>
+      <w:r>
         <w:t xml:space="preserve">            // Формат строки: Название | симптом1, симптом2, ...</w:t>
       </w:r>
     </w:p>
     <w:p>
       <w:pPr>
-        <w:spacing w:line="240" w:lineRule="auto"/>
-      </w:pPr>
-      <w:r>
-        <w:rPr>
-          <w:i/>
-          <w:sz w:val="24"/>
-        </w:rPr>
+        <w:pStyle w:val="Listing"/>
+      </w:pPr>
+      <w:r>
         <w:t xml:space="preserve">            String[] parts = line.split("\\|");</w:t>
       </w:r>
     </w:p>
     <w:p>
       <w:pPr>
-        <w:spacing w:line="240" w:lineRule="auto"/>
-      </w:pPr>
-      <w:r>
-        <w:rPr>
-          <w:i/>
-          <w:sz w:val="24"/>
-        </w:rPr>
+        <w:pStyle w:val="Listing"/>
+      </w:pPr>
+      <w:r>
         <w:t xml:space="preserve">            if (parts.length &lt; 2) {</w:t>
       </w:r>
     </w:p>
     <w:p>
       <w:pPr>
-        <w:spacing w:line="240" w:lineRule="auto"/>
-      </w:pPr>
-      <w:r>
-        <w:rPr>
-          <w:i/>
-          <w:sz w:val="24"/>
-        </w:rPr>
+        <w:pStyle w:val="Listing"/>
+      </w:pPr>
+      <w:r>
         <w:t xml:space="preserve">                continue;</w:t>
       </w:r>
     </w:p>
     <w:p>
       <w:pPr>
-        <w:spacing w:line="240" w:lineRule="auto"/>
-      </w:pPr>
-      <w:r>
-        <w:rPr>
-          <w:i/>
-          <w:sz w:val="24"/>
-        </w:rPr>
+        <w:pStyle w:val="Listing"/>
+      </w:pPr>
+      <w:r>
         <w:t xml:space="preserve">            }</w:t>
       </w:r>
     </w:p>
     <w:p>
       <w:pPr>
-        <w:spacing w:line="240" w:lineRule="auto"/>
-      </w:pPr>
-      <w:r>
-        <w:rPr>
-          <w:i/>
-          <w:sz w:val="24"/>
-        </w:rPr>
+        <w:pStyle w:val="Listing"/>
+      </w:pPr>
+      <w:r>
         <w:t xml:space="preserve">            String name = parts[0].trim();</w:t>
       </w:r>
     </w:p>
     <w:p>
       <w:pPr>
-        <w:spacing w:line="240" w:lineRule="auto"/>
-      </w:pPr>
-      <w:r>
-        <w:rPr>
-          <w:i/>
-          <w:sz w:val="24"/>
-        </w:rPr>
+        <w:pStyle w:val="Listing"/>
+      </w:pPr>
+      <w:r>
         <w:t xml:space="preserve">            int coincidenceCount = testSymptoms(parts[1], keywords);</w:t>
       </w:r>
     </w:p>
     <w:p>
       <w:pPr>
-        <w:spacing w:line="240" w:lineRule="auto"/>
-      </w:pPr>
-      <w:r>
-        <w:rPr>
-          <w:i/>
-          <w:sz w:val="24"/>
-        </w:rPr>
+        <w:pStyle w:val="Listing"/>
+      </w:pPr>
+      <w:r>
         <w:t xml:space="preserve">            textArea.append("\n" + name + "  :" + coincidenceCount);</w:t>
       </w:r>
     </w:p>
     <w:p>
       <w:pPr>
-        <w:spacing w:line="240" w:lineRule="auto"/>
-      </w:pPr>
-      <w:r>
-        <w:rPr>
-          <w:i/>
-          <w:sz w:val="24"/>
-        </w:rPr>
+        <w:pStyle w:val="Listing"/>
+      </w:pPr>
+      <w:r>
         <w:t xml:space="preserve">            if (coincidenceCount &gt; bestCount) {</w:t>
       </w:r>
     </w:p>
     <w:p>
       <w:pPr>
-        <w:spacing w:line="240" w:lineRule="auto"/>
-      </w:pPr>
-      <w:r>
-        <w:rPr>
-          <w:i/>
-          <w:sz w:val="24"/>
-        </w:rPr>
+        <w:pStyle w:val="Listing"/>
+      </w:pPr>
+      <w:r>
         <w:t xml:space="preserve">                bestCount = coincidenceCount;</w:t>
       </w:r>
     </w:p>
     <w:p>
       <w:pPr>
-        <w:spacing w:line="240" w:lineRule="auto"/>
-      </w:pPr>
-      <w:r>
-        <w:rPr>
-          <w:i/>
-          <w:sz w:val="24"/>
-        </w:rPr>
+        <w:pStyle w:val="Listing"/>
+      </w:pPr>
+      <w:r>
         <w:t xml:space="preserve">                bestName = name;</w:t>
       </w:r>
     </w:p>
     <w:p>
       <w:pPr>
-        <w:spacing w:line="240" w:lineRule="auto"/>
-      </w:pPr>
-      <w:r>
-        <w:rPr>
-          <w:i/>
-          <w:sz w:val="24"/>
-        </w:rPr>
+        <w:pStyle w:val="Listing"/>
+      </w:pPr>
+      <w:r>
         <w:t xml:space="preserve">            }</w:t>
       </w:r>
     </w:p>
     <w:p>
       <w:pPr>
-        <w:spacing w:line="240" w:lineRule="auto"/>
-      </w:pPr>
-      <w:r>
-        <w:rPr>
-          <w:i/>
-          <w:sz w:val="24"/>
-        </w:rPr>
+        <w:pStyle w:val="Listing"/>
+      </w:pPr>
+      <w:r>
         <w:t xml:space="preserve">        }</w:t>
       </w:r>
     </w:p>
     <w:p>
       <w:pPr>
-        <w:spacing w:line="240" w:lineRule="auto"/>
-      </w:pPr>
-    </w:p>
-    <w:p>
-      <w:pPr>
-        <w:spacing w:line="240" w:lineRule="auto"/>
-      </w:pPr>
-      <w:r>
-        <w:rPr>
-          <w:i/>
-          <w:sz w:val="24"/>
-        </w:rPr>
+        <w:pStyle w:val="Listing"/>
+      </w:pPr>
+    </w:p>
+    <w:p>
+      <w:pPr>
+        <w:pStyle w:val="Listing"/>
+      </w:pPr>
+      <w:r>
         <w:t xml:space="preserve">        if (bestName == null) {</w:t>
       </w:r>
     </w:p>
     <w:p>
       <w:pPr>
-        <w:spacing w:line="240" w:lineRule="auto"/>
-      </w:pPr>
-      <w:r>
-        <w:rPr>
-          <w:i/>
-          <w:sz w:val="24"/>
-        </w:rPr>
+        <w:pStyle w:val="Listing"/>
+      </w:pPr>
+      <w:r>
         <w:t xml:space="preserve">            textArea.append("\nЛекарство не найдено");</w:t>
       </w:r>
     </w:p>
     <w:p>
       <w:pPr>
-        <w:spacing w:line="240" w:lineRule="auto"/>
-      </w:pPr>
-      <w:r>
-        <w:rPr>
-          <w:i/>
-          <w:sz w:val="24"/>
-        </w:rPr>
+        <w:pStyle w:val="Listing"/>
+      </w:pPr>
+      <w:r>
         <w:t xml:space="preserve">        } else {</w:t>
       </w:r>
     </w:p>
     <w:p>
       <w:pPr>
-        <w:spacing w:line="240" w:lineRule="auto"/>
-      </w:pPr>
-      <w:r>
-        <w:rPr>
-          <w:i/>
-          <w:sz w:val="24"/>
-        </w:rPr>
+        <w:pStyle w:val="Listing"/>
+      </w:pPr>
+      <w:r>
         <w:t xml:space="preserve">            textArea.append("\n\nЛекарство: " + bestName);</w:t>
       </w:r>
     </w:p>
     <w:p>
       <w:pPr>
-        <w:spacing w:line="240" w:lineRule="auto"/>
-      </w:pPr>
-      <w:r>
-        <w:rPr>
-          <w:i/>
-          <w:sz w:val="24"/>
-        </w:rPr>
+        <w:pStyle w:val="Listing"/>
+      </w:pPr>
+      <w:r>
         <w:t xml:space="preserve">            openInBrowser(new File("source_html", bestName + ".html"));</w:t>
       </w:r>
     </w:p>
     <w:p>
       <w:pPr>
-        <w:spacing w:line="240" w:lineRule="auto"/>
-      </w:pPr>
-      <w:r>
-        <w:rPr>
-          <w:i/>
-          <w:sz w:val="24"/>
-        </w:rPr>
+        <w:pStyle w:val="Listing"/>
+      </w:pPr>
+      <w:r>
         <w:t xml:space="preserve">        }</w:t>
       </w:r>
     </w:p>
     <w:p>
       <w:pPr>
-        <w:spacing w:line="240" w:lineRule="auto"/>
-      </w:pPr>
-      <w:r>
-        <w:rPr>
-          <w:i/>
-          <w:sz w:val="24"/>
-        </w:rPr>
+        <w:pStyle w:val="Listing"/>
+      </w:pPr>
+      <w:r>
         <w:t xml:space="preserve">    }</w:t>
       </w:r>
     </w:p>
     <w:p>
       <w:pPr>
-        <w:spacing w:line="240" w:lineRule="auto"/>
-      </w:pPr>
-      <w:r>
-        <w:rPr>
-          <w:i/>
-          <w:sz w:val="24"/>
-        </w:rPr>
+        <w:pStyle w:val="Listing"/>
+      </w:pPr>
+      <w:r>
         <w:t>}</w:t>
       </w:r>
     </w:p>
@@ -2613,501 +2470,324 @@
     </w:p>
     <w:p>
       <w:pPr>
-        <w:spacing w:line="240" w:lineRule="auto"/>
-      </w:pPr>
-      <w:r>
-        <w:rPr>
-          <w:i/>
-          <w:sz w:val="24"/>
-        </w:rPr>
-        <w:t>// Чтение строк файла через URL</w:t>
-      </w:r>
-      <w:r>
-        <w:rPr>
-          <w:i/>
-          <w:sz w:val="24"/>
-        </w:rPr>
-        <w:t xml:space="preserve"> и потоковые классы</w:t>
-      </w:r>
-    </w:p>
-    <w:p>
-      <w:pPr>
-        <w:spacing w:line="240" w:lineRule="auto"/>
-      </w:pPr>
-      <w:r>
-        <w:rPr>
-          <w:i/>
-          <w:sz w:val="24"/>
-        </w:rPr>
+        <w:pStyle w:val="Listing"/>
+      </w:pPr>
+      <w:r>
+        <w:t>// Чтение строк файла через URL и потоковые классы</w:t>
+      </w:r>
+    </w:p>
+    <w:p>
+      <w:pPr>
+        <w:pStyle w:val="Listing"/>
+      </w:pPr>
+      <w:r>
         <w:t>private ArrayList&lt;String&gt; readLines(File file) {</w:t>
       </w:r>
     </w:p>
     <w:p>
       <w:pPr>
-        <w:spacing w:line="240" w:lineRule="auto"/>
-      </w:pPr>
-      <w:r>
-        <w:rPr>
-          <w:i/>
-          <w:sz w:val="24"/>
-        </w:rPr>
+        <w:pStyle w:val="Listing"/>
+      </w:pPr>
+      <w:r>
         <w:t xml:space="preserve">    ArrayList&lt;String&gt; lines = new ArrayList&lt;&gt;();</w:t>
       </w:r>
     </w:p>
     <w:p>
       <w:pPr>
-        <w:spacing w:line="240" w:lineRule="auto"/>
-      </w:pPr>
-      <w:r>
-        <w:rPr>
-          <w:i/>
-          <w:sz w:val="24"/>
-        </w:rPr>
+        <w:pStyle w:val="Listing"/>
+      </w:pPr>
+      <w:r>
         <w:t xml:space="preserve">    try {</w:t>
       </w:r>
     </w:p>
     <w:p>
       <w:pPr>
-        <w:spacing w:line="240" w:lineRule="auto"/>
-      </w:pPr>
-      <w:r>
-        <w:rPr>
-          <w:i/>
-          <w:sz w:val="24"/>
-        </w:rPr>
+        <w:pStyle w:val="Listing"/>
+      </w:pPr>
+      <w:r>
         <w:t xml:space="preserve">        URL url = file.toURI().toURL();</w:t>
       </w:r>
     </w:p>
     <w:p>
       <w:pPr>
-        <w:spacing w:line="240" w:lineRule="auto"/>
-      </w:pPr>
-      <w:r>
-        <w:rPr>
-          <w:i/>
-          <w:sz w:val="24"/>
-        </w:rPr>
+        <w:pStyle w:val="Listing"/>
+      </w:pPr>
+      <w:r>
         <w:t xml:space="preserve">        URLConnection connection = url.openConnection();</w:t>
       </w:r>
     </w:p>
     <w:p>
       <w:pPr>
-        <w:spacing w:line="240" w:lineRule="auto"/>
-      </w:pPr>
-      <w:r>
-        <w:rPr>
-          <w:i/>
-          <w:sz w:val="24"/>
-        </w:rPr>
+        <w:pStyle w:val="Listing"/>
+      </w:pPr>
+      <w:r>
         <w:lastRenderedPageBreak/>
         <w:t xml:space="preserve">        try (BufferedReader reader = new BufferedReader(</w:t>
       </w:r>
     </w:p>
     <w:p>
       <w:pPr>
-        <w:spacing w:line="240" w:lineRule="auto"/>
-      </w:pPr>
-      <w:r>
-        <w:rPr>
-          <w:i/>
-          <w:sz w:val="24"/>
-        </w:rPr>
+        <w:pStyle w:val="Listing"/>
+      </w:pPr>
+      <w:r>
         <w:t xml:space="preserve">                new InputStreamReader(connection.getInputStream(), "UTF-8"))) {</w:t>
       </w:r>
     </w:p>
     <w:p>
       <w:pPr>
-        <w:spacing w:line="240" w:lineRule="auto"/>
-      </w:pPr>
-      <w:r>
-        <w:rPr>
-          <w:i/>
-          <w:sz w:val="24"/>
-        </w:rPr>
+        <w:pStyle w:val="Listing"/>
+      </w:pPr>
+      <w:r>
         <w:t xml:space="preserve">            String line;</w:t>
       </w:r>
     </w:p>
     <w:p>
       <w:pPr>
-        <w:spacing w:line="240" w:lineRule="auto"/>
-      </w:pPr>
-      <w:r>
-        <w:rPr>
-          <w:i/>
-          <w:sz w:val="24"/>
-        </w:rPr>
+        <w:pStyle w:val="Listing"/>
+      </w:pPr>
+      <w:r>
         <w:t xml:space="preserve">            while ((line = reader.readLine()) != null) {</w:t>
       </w:r>
     </w:p>
     <w:p>
       <w:pPr>
-        <w:spacing w:line="240" w:lineRule="auto"/>
-      </w:pPr>
-      <w:r>
-        <w:rPr>
-          <w:i/>
-          <w:sz w:val="24"/>
-        </w:rPr>
-        <w:t xml:space="preserve">                if (!line.trim().isEmpty() &amp;&amp; !line.startsWith</w:t>
-      </w:r>
-      <w:r>
-        <w:rPr>
-          <w:i/>
-          <w:sz w:val="24"/>
-        </w:rPr>
-        <w:t>("#")) {</w:t>
-      </w:r>
-    </w:p>
-    <w:p>
-      <w:pPr>
-        <w:spacing w:line="240" w:lineRule="auto"/>
-      </w:pPr>
-      <w:r>
-        <w:rPr>
-          <w:i/>
-          <w:sz w:val="24"/>
-        </w:rPr>
+        <w:pStyle w:val="Listing"/>
+      </w:pPr>
+      <w:r>
+        <w:t xml:space="preserve">                if (!line.trim().isEmpty() &amp;&amp; !line.startsWith("#")) {</w:t>
+      </w:r>
+    </w:p>
+    <w:p>
+      <w:pPr>
+        <w:pStyle w:val="Listing"/>
+      </w:pPr>
+      <w:r>
         <w:t xml:space="preserve">                    lines.add(line);</w:t>
       </w:r>
     </w:p>
     <w:p>
       <w:pPr>
-        <w:spacing w:line="240" w:lineRule="auto"/>
-      </w:pPr>
-      <w:r>
-        <w:rPr>
-          <w:i/>
-          <w:sz w:val="24"/>
-        </w:rPr>
+        <w:pStyle w:val="Listing"/>
+      </w:pPr>
+      <w:r>
         <w:t xml:space="preserve">                }</w:t>
       </w:r>
     </w:p>
     <w:p>
       <w:pPr>
-        <w:spacing w:line="240" w:lineRule="auto"/>
-      </w:pPr>
-      <w:r>
-        <w:rPr>
-          <w:i/>
-          <w:sz w:val="24"/>
-        </w:rPr>
+        <w:pStyle w:val="Listing"/>
+      </w:pPr>
+      <w:r>
         <w:t xml:space="preserve">            }</w:t>
       </w:r>
     </w:p>
     <w:p>
       <w:pPr>
-        <w:spacing w:line="240" w:lineRule="auto"/>
-      </w:pPr>
-      <w:r>
-        <w:rPr>
-          <w:i/>
-          <w:sz w:val="24"/>
-        </w:rPr>
+        <w:pStyle w:val="Listing"/>
+      </w:pPr>
+      <w:r>
         <w:t xml:space="preserve">        }</w:t>
       </w:r>
     </w:p>
     <w:p>
       <w:pPr>
-        <w:spacing w:line="240" w:lineRule="auto"/>
-      </w:pPr>
-      <w:r>
-        <w:rPr>
-          <w:i/>
-          <w:sz w:val="24"/>
-        </w:rPr>
+        <w:pStyle w:val="Listing"/>
+      </w:pPr>
+      <w:r>
         <w:t xml:space="preserve">    } catch (IOException e) {</w:t>
       </w:r>
     </w:p>
     <w:p>
       <w:pPr>
-        <w:spacing w:line="240" w:lineRule="auto"/>
-      </w:pPr>
-      <w:r>
-        <w:rPr>
-          <w:i/>
-          <w:sz w:val="24"/>
-        </w:rPr>
+        <w:pStyle w:val="Listing"/>
+      </w:pPr>
+      <w:r>
         <w:t xml:space="preserve">        System.out.println("Error: " + e.getMessage());</w:t>
       </w:r>
     </w:p>
     <w:p>
       <w:pPr>
-        <w:spacing w:line="240" w:lineRule="auto"/>
-      </w:pPr>
-      <w:r>
-        <w:rPr>
-          <w:i/>
-          <w:sz w:val="24"/>
-        </w:rPr>
+        <w:pStyle w:val="Listing"/>
+      </w:pPr>
+      <w:r>
         <w:t xml:space="preserve">    }</w:t>
       </w:r>
     </w:p>
     <w:p>
       <w:pPr>
-        <w:spacing w:line="240" w:lineRule="auto"/>
-      </w:pPr>
-      <w:r>
-        <w:rPr>
-          <w:i/>
-          <w:sz w:val="24"/>
-        </w:rPr>
+        <w:pStyle w:val="Listing"/>
+      </w:pPr>
+      <w:r>
         <w:t xml:space="preserve">    return lines;</w:t>
       </w:r>
     </w:p>
     <w:p>
       <w:pPr>
-        <w:spacing w:line="240" w:lineRule="auto"/>
-      </w:pPr>
-      <w:r>
-        <w:rPr>
-          <w:i/>
-          <w:sz w:val="24"/>
-        </w:rPr>
+        <w:pStyle w:val="Listing"/>
+      </w:pPr>
+      <w:r>
         <w:t>}</w:t>
       </w:r>
     </w:p>
     <w:p>
       <w:pPr>
-        <w:spacing w:line="240" w:lineRule="auto"/>
-      </w:pPr>
-    </w:p>
-    <w:p>
-      <w:pPr>
-        <w:spacing w:line="240" w:lineRule="auto"/>
-      </w:pPr>
-      <w:r>
-        <w:rPr>
-          <w:i/>
-          <w:sz w:val="24"/>
-        </w:rPr>
+        <w:pStyle w:val="Listing"/>
+      </w:pPr>
+    </w:p>
+    <w:p>
+      <w:pPr>
+        <w:pStyle w:val="Listing"/>
+      </w:pPr>
+      <w:r>
         <w:t>// Число ключевых слов, найденных среди симптомов лекарства</w:t>
       </w:r>
     </w:p>
     <w:p>
       <w:pPr>
-        <w:spacing w:line="240" w:lineRule="auto"/>
-      </w:pPr>
-      <w:r>
-        <w:rPr>
-          <w:i/>
-          <w:sz w:val="24"/>
-        </w:rPr>
+        <w:pStyle w:val="Listing"/>
+      </w:pPr>
+      <w:r>
         <w:t>private int testSymptoms(String symptoms, String[] keywords) {</w:t>
       </w:r>
     </w:p>
     <w:p>
       <w:pPr>
-        <w:spacing w:line="240" w:lineRule="auto"/>
-      </w:pPr>
-      <w:r>
-        <w:rPr>
-          <w:i/>
-          <w:sz w:val="24"/>
-        </w:rPr>
+        <w:pStyle w:val="Listing"/>
+      </w:pPr>
+      <w:r>
         <w:t xml:space="preserve">    int results = 0;</w:t>
       </w:r>
     </w:p>
     <w:p>
       <w:pPr>
-        <w:spacing w:line="240" w:lineRule="auto"/>
-      </w:pPr>
-      <w:r>
-        <w:rPr>
-          <w:i/>
-          <w:sz w:val="24"/>
-        </w:rPr>
+        <w:pStyle w:val="Listing"/>
+      </w:pPr>
+      <w:r>
         <w:t xml:space="preserve">    String content = symptoms.toLowerCase();</w:t>
       </w:r>
     </w:p>
     <w:p>
       <w:pPr>
-        <w:spacing w:line="240" w:lineRule="auto"/>
-      </w:pPr>
-      <w:r>
-        <w:rPr>
-          <w:i/>
-          <w:sz w:val="24"/>
-        </w:rPr>
+        <w:pStyle w:val="Listing"/>
+      </w:pPr>
+      <w:r>
         <w:t xml:space="preserve">    for (String keyword : keywords) {</w:t>
       </w:r>
     </w:p>
     <w:p>
       <w:pPr>
-        <w:spacing w:line="240" w:lineRule="auto"/>
-      </w:pPr>
-      <w:r>
-        <w:rPr>
-          <w:i/>
-          <w:sz w:val="24"/>
-        </w:rPr>
-        <w:t xml:space="preserve">        if (!keyword.trim().isEmpty() &amp;&amp; content.contains(keyword.trim().toLowerCase</w:t>
-      </w:r>
-      <w:r>
-        <w:rPr>
-          <w:i/>
-          <w:sz w:val="24"/>
-        </w:rPr>
-        <w:t>())) {</w:t>
-      </w:r>
-    </w:p>
-    <w:p>
-      <w:pPr>
-        <w:spacing w:line="240" w:lineRule="auto"/>
-      </w:pPr>
-      <w:r>
-        <w:rPr>
-          <w:i/>
-          <w:sz w:val="24"/>
-        </w:rPr>
+        <w:pStyle w:val="Listing"/>
+      </w:pPr>
+      <w:r>
+        <w:t xml:space="preserve">        if (!keyword.trim().isEmpty() &amp;&amp; content.contains(keyword.trim().toLowerCase())) {</w:t>
+      </w:r>
+    </w:p>
+    <w:p>
+      <w:pPr>
+        <w:pStyle w:val="Listing"/>
+      </w:pPr>
+      <w:r>
         <w:t xml:space="preserve">            results++;</w:t>
       </w:r>
     </w:p>
     <w:p>
       <w:pPr>
-        <w:spacing w:line="240" w:lineRule="auto"/>
-      </w:pPr>
-      <w:r>
-        <w:rPr>
-          <w:i/>
-          <w:sz w:val="24"/>
-        </w:rPr>
+        <w:pStyle w:val="Listing"/>
+      </w:pPr>
+      <w:r>
         <w:t xml:space="preserve">        }</w:t>
       </w:r>
     </w:p>
     <w:p>
       <w:pPr>
-        <w:spacing w:line="240" w:lineRule="auto"/>
-      </w:pPr>
-      <w:r>
-        <w:rPr>
-          <w:i/>
-          <w:sz w:val="24"/>
-        </w:rPr>
+        <w:pStyle w:val="Listing"/>
+      </w:pPr>
+      <w:r>
         <w:t xml:space="preserve">    }</w:t>
       </w:r>
     </w:p>
     <w:p>
       <w:pPr>
-        <w:spacing w:line="240" w:lineRule="auto"/>
-      </w:pPr>
-      <w:r>
-        <w:rPr>
-          <w:i/>
-          <w:sz w:val="24"/>
-        </w:rPr>
+        <w:pStyle w:val="Listing"/>
+      </w:pPr>
+      <w:r>
         <w:t xml:space="preserve">    return results;</w:t>
       </w:r>
     </w:p>
     <w:p>
       <w:pPr>
-        <w:spacing w:line="240" w:lineRule="auto"/>
-      </w:pPr>
-      <w:r>
-        <w:rPr>
-          <w:i/>
-          <w:sz w:val="24"/>
-        </w:rPr>
+        <w:pStyle w:val="Listing"/>
+      </w:pPr>
+      <w:r>
         <w:t>}</w:t>
       </w:r>
     </w:p>
     <w:p>
       <w:pPr>
-        <w:spacing w:line="240" w:lineRule="auto"/>
-      </w:pPr>
-    </w:p>
-    <w:p>
-      <w:pPr>
-        <w:spacing w:line="240" w:lineRule="auto"/>
-      </w:pPr>
-      <w:r>
-        <w:rPr>
-          <w:i/>
-          <w:sz w:val="24"/>
-        </w:rPr>
+        <w:pStyle w:val="Listing"/>
+      </w:pPr>
+    </w:p>
+    <w:p>
+      <w:pPr>
+        <w:pStyle w:val="Listing"/>
+      </w:pPr>
+      <w:r>
         <w:t>// Открытие html-документа в браузере</w:t>
       </w:r>
     </w:p>
     <w:p>
       <w:pPr>
-        <w:spacing w:line="240" w:lineRule="auto"/>
-      </w:pPr>
-      <w:r>
-        <w:rPr>
-          <w:i/>
-          <w:sz w:val="24"/>
-        </w:rPr>
+        <w:pStyle w:val="Listing"/>
+      </w:pPr>
+      <w:r>
         <w:t>private void openInBrowser(File file) {</w:t>
       </w:r>
     </w:p>
     <w:p>
       <w:pPr>
-        <w:spacing w:line="240" w:lineRule="auto"/>
-      </w:pPr>
-      <w:r>
-        <w:rPr>
-          <w:i/>
-          <w:sz w:val="24"/>
-        </w:rPr>
+        <w:pStyle w:val="Listing"/>
+      </w:pPr>
+      <w:r>
         <w:t xml:space="preserve">    try {</w:t>
       </w:r>
     </w:p>
     <w:p>
       <w:pPr>
-        <w:spacing w:line="240" w:lineRule="auto"/>
-      </w:pPr>
-      <w:r>
-        <w:rPr>
-          <w:i/>
-          <w:sz w:val="24"/>
-        </w:rPr>
+        <w:pStyle w:val="Listing"/>
+      </w:pPr>
+      <w:r>
         <w:t xml:space="preserve">        Desktop.getDesktop().browse(file.getAbsoluteFile().toURI());</w:t>
       </w:r>
     </w:p>
     <w:p>
       <w:pPr>
-        <w:spacing w:line="240" w:lineRule="auto"/>
-      </w:pPr>
-      <w:r>
-        <w:rPr>
-          <w:i/>
-          <w:sz w:val="24"/>
-        </w:rPr>
+        <w:pStyle w:val="Listing"/>
+      </w:pPr>
+      <w:r>
         <w:t xml:space="preserve">    } catch (IOException e) {</w:t>
       </w:r>
     </w:p>
     <w:p>
       <w:pPr>
-        <w:spacing w:line="240" w:lineRule="auto"/>
-      </w:pPr>
-      <w:r>
-        <w:rPr>
-          <w:i/>
-          <w:sz w:val="24"/>
-        </w:rPr>
+        <w:pStyle w:val="Listing"/>
+      </w:pPr>
+      <w:r>
         <w:t xml:space="preserve">        System.out.println("Error: " + e.getMessage());</w:t>
       </w:r>
     </w:p>
     <w:p>
       <w:pPr>
-        <w:spacing w:line="240" w:lineRule="auto"/>
-      </w:pPr>
-      <w:r>
-        <w:rPr>
-          <w:i/>
-          <w:sz w:val="24"/>
-        </w:rPr>
+        <w:pStyle w:val="Listing"/>
+      </w:pPr>
+      <w:r>
         <w:t xml:space="preserve">    }</w:t>
       </w:r>
     </w:p>
     <w:p>
       <w:pPr>
-        <w:spacing w:line="240" w:lineRule="auto"/>
-      </w:pPr>
-      <w:r>
-        <w:rPr>
-          <w:i/>
-          <w:sz w:val="24"/>
-        </w:rPr>
+        <w:pStyle w:val="Listing"/>
+      </w:pPr>
+      <w:r>
         <w:t>}</w:t>
       </w:r>
     </w:p>
@@ -3118,7 +2798,7 @@
         <w:spacing w:before="360"/>
         <w:ind w:firstLine="709"/>
       </w:pPr>
-      <w:bookmarkStart w:id="6" w:name="_Toc242378918"/>
+      <w:bookmarkStart w:id="6" w:name="_Toc242385928"/>
       <w:r>
         <w:rPr>
           <w:rFonts w:ascii="Times New Roman" w:hAnsi="Times New Roman"/>
@@ -3148,7 +2828,7 @@
         </w:rPr>
         <w:lastRenderedPageBreak/>
         <w:drawing>
-          <wp:inline distT="0" distB="0" distL="0" distR="0" wp14:anchorId="72CFD37F" wp14:editId="29F1B675">
+          <wp:inline distT="0" distB="0" distL="0" distR="0" wp14:anchorId="3F495301" wp14:editId="7B021D3C">
             <wp:extent cx="5580000" cy="3055113"/>
             <wp:effectExtent l="0" t="0" r="0" b="0"/>
             <wp:docPr id="1" name="Picture 1"/>
@@ -3241,7 +2921,7 @@
           <w:noProof/>
         </w:rPr>
         <w:drawing>
-          <wp:inline distT="0" distB="0" distL="0" distR="0" wp14:anchorId="38F18224" wp14:editId="241A7E8A">
+          <wp:inline distT="0" distB="0" distL="0" distR="0" wp14:anchorId="1B2878C4" wp14:editId="7AADB551">
             <wp:extent cx="5580000" cy="3055113"/>
             <wp:effectExtent l="0" t="0" r="0" b="0"/>
             <wp:docPr id="2" name="Picture 2"/>
@@ -3317,7 +2997,7 @@
           <w:noProof/>
         </w:rPr>
         <w:drawing>
-          <wp:inline distT="0" distB="0" distL="0" distR="0" wp14:anchorId="27753758" wp14:editId="56D9022F">
+          <wp:inline distT="0" distB="0" distL="0" distR="0" wp14:anchorId="7511D484" wp14:editId="4812C1F7">
             <wp:extent cx="5580000" cy="3055113"/>
             <wp:effectExtent l="0" t="0" r="0" b="0"/>
             <wp:docPr id="3" name="Picture 3"/>
@@ -3392,7 +3072,7 @@
           <w:noProof/>
         </w:rPr>
         <w:drawing>
-          <wp:inline distT="0" distB="0" distL="0" distR="0" wp14:anchorId="5E35AF65" wp14:editId="4C96AC3A">
+          <wp:inline distT="0" distB="0" distL="0" distR="0" wp14:anchorId="12A7FDDF" wp14:editId="51C2FF05">
             <wp:extent cx="5580000" cy="3055113"/>
             <wp:effectExtent l="0" t="0" r="0" b="0"/>
             <wp:docPr id="4" name="Picture 4"/>
@@ -3477,7 +3157,7 @@
           <w:noProof/>
         </w:rPr>
         <w:drawing>
-          <wp:inline distT="0" distB="0" distL="0" distR="0" wp14:anchorId="4B5A148C" wp14:editId="59D312C7">
+          <wp:inline distT="0" distB="0" distL="0" distR="0" wp14:anchorId="40BE46B2" wp14:editId="5EAAF95F">
             <wp:extent cx="5580000" cy="1860000"/>
             <wp:effectExtent l="0" t="0" r="0" b="0"/>
             <wp:docPr id="5" name="Picture 5"/>
@@ -3542,7 +3222,7 @@
         <w:pStyle w:val="1"/>
         <w:ind w:firstLine="709"/>
       </w:pPr>
-      <w:bookmarkStart w:id="7" w:name="_Toc242378919"/>
+      <w:bookmarkStart w:id="7" w:name="_Toc242385929"/>
       <w:r>
         <w:rPr>
           <w:rFonts w:ascii="Times New Roman" w:hAnsi="Times New Roman"/>
@@ -3558,7 +3238,7 @@
         <w:spacing w:before="360"/>
         <w:ind w:firstLine="709"/>
       </w:pPr>
-      <w:bookmarkStart w:id="8" w:name="_Toc242378920"/>
+      <w:bookmarkStart w:id="8" w:name="_Toc242385930"/>
       <w:r>
         <w:rPr>
           <w:rFonts w:ascii="Times New Roman" w:hAnsi="Times New Roman"/>
@@ -3679,7 +3359,7 @@
         <w:spacing w:before="360"/>
         <w:ind w:firstLine="709"/>
       </w:pPr>
-      <w:bookmarkStart w:id="9" w:name="_Toc242378921"/>
+      <w:bookmarkStart w:id="9" w:name="_Toc242385931"/>
       <w:r>
         <w:rPr>
           <w:rFonts w:ascii="Times New Roman" w:hAnsi="Times New Roman"/>
@@ -3775,7 +3455,7 @@
         <w:spacing w:before="360"/>
         <w:ind w:firstLine="709"/>
       </w:pPr>
-      <w:bookmarkStart w:id="10" w:name="_Toc242378922"/>
+      <w:bookmarkStart w:id="10" w:name="_Toc242385932"/>
       <w:r>
         <w:rPr>
           <w:rFonts w:ascii="Times New Roman" w:hAnsi="Times New Roman"/>
@@ -3881,7 +3561,7 @@
         <w:spacing w:before="360"/>
         <w:ind w:firstLine="709"/>
       </w:pPr>
-      <w:bookmarkStart w:id="11" w:name="_Toc242378923"/>
+      <w:bookmarkStart w:id="11" w:name="_Toc242385933"/>
       <w:r>
         <w:rPr>
           <w:rFonts w:ascii="Times New Roman" w:hAnsi="Times New Roman"/>
@@ -3969,7 +3649,7 @@
         <w:pStyle w:val="1"/>
         <w:jc w:val="center"/>
       </w:pPr>
-      <w:bookmarkStart w:id="12" w:name="_Toc242378924"/>
+      <w:bookmarkStart w:id="12" w:name="_Toc242385934"/>
       <w:r>
         <w:rPr>
           <w:rFonts w:ascii="Times New Roman" w:hAnsi="Times New Roman"/>
@@ -4277,31 +3957,31 @@
       </w:rPr>
     </w:lvl>
   </w:abstractNum>
-  <w:num w:numId="1" w16cid:durableId="2040817506">
+  <w:num w:numId="1" w16cid:durableId="778647475">
     <w:abstractNumId w:val="8"/>
   </w:num>
-  <w:num w:numId="2" w16cid:durableId="585655817">
+  <w:num w:numId="2" w16cid:durableId="2068797499">
     <w:abstractNumId w:val="6"/>
   </w:num>
-  <w:num w:numId="3" w16cid:durableId="2085183404">
+  <w:num w:numId="3" w16cid:durableId="1783845183">
     <w:abstractNumId w:val="5"/>
   </w:num>
-  <w:num w:numId="4" w16cid:durableId="676074423">
+  <w:num w:numId="4" w16cid:durableId="1611475739">
     <w:abstractNumId w:val="4"/>
   </w:num>
-  <w:num w:numId="5" w16cid:durableId="125124639">
+  <w:num w:numId="5" w16cid:durableId="647325909">
     <w:abstractNumId w:val="7"/>
   </w:num>
-  <w:num w:numId="6" w16cid:durableId="109670330">
+  <w:num w:numId="6" w16cid:durableId="1796410528">
     <w:abstractNumId w:val="3"/>
   </w:num>
-  <w:num w:numId="7" w16cid:durableId="1403720521">
+  <w:num w:numId="7" w16cid:durableId="1651787280">
     <w:abstractNumId w:val="2"/>
   </w:num>
-  <w:num w:numId="8" w16cid:durableId="1277518343">
+  <w:num w:numId="8" w16cid:durableId="1622759989">
     <w:abstractNumId w:val="1"/>
   </w:num>
-  <w:num w:numId="9" w16cid:durableId="1185552576">
+  <w:num w:numId="9" w16cid:durableId="984242659">
     <w:abstractNumId w:val="0"/>
   </w:num>
 </w:numbering>
@@ -15689,6 +15369,17 @@
       </w:tcPr>
     </w:tblStylePr>
   </w:style>
+  <w:style w:type="paragraph" w:customStyle="1" w:styleId="Listing">
+    <w:name w:val="Listing"/>
+    <w:basedOn w:val="a1"/>
+    <w:pPr>
+      <w:spacing w:line="240" w:lineRule="auto"/>
+    </w:pPr>
+    <w:rPr>
+      <w:i/>
+      <w:sz w:val="24"/>
+    </w:rPr>
+  </w:style>
   <w:style w:type="paragraph" w:styleId="14">
     <w:name w:val="toc 1"/>
     <w:basedOn w:val="a1"/>
@@ -15696,7 +15387,7 @@
     <w:autoRedefine/>
     <w:uiPriority w:val="39"/>
     <w:unhideWhenUsed/>
-    <w:rsid w:val="00994F01"/>
+    <w:rsid w:val="002D5C9D"/>
     <w:pPr>
       <w:spacing w:after="100"/>
     </w:pPr>
@@ -15708,7 +15399,7 @@
     <w:autoRedefine/>
     <w:uiPriority w:val="39"/>
     <w:unhideWhenUsed/>
-    <w:rsid w:val="00994F01"/>
+    <w:rsid w:val="002D5C9D"/>
     <w:pPr>
       <w:spacing w:after="100"/>
       <w:ind w:left="280"/>
@@ -15719,7 +15410,7 @@
     <w:basedOn w:val="a2"/>
     <w:uiPriority w:val="99"/>
     <w:unhideWhenUsed/>
-    <w:rsid w:val="00994F01"/>
+    <w:rsid w:val="002D5C9D"/>
     <w:rPr>
       <w:color w:val="0000FF" w:themeColor="hyperlink"/>
       <w:u w:val="single"/>

</xml_diff>